<commit_message>
updates: descriptive coding done, criteria is ongoing
</commit_message>
<xml_diff>
--- a/coding/descriptive/v2_codebook_descriptive.docx
+++ b/coding/descriptive/v2_codebook_descriptive.docx
@@ -4264,6 +4264,7 @@
       <w:tr>
         <w:trPr>
           <w:cantSplit w:val="0"/>
+          <w:trHeight w:val="237.19377790178572" w:hRule="atLeast"/>
           <w:tblHeader w:val="0"/>
         </w:trPr>
         <w:tc>
@@ -4322,6 +4323,7 @@
       <w:tr>
         <w:trPr>
           <w:cantSplit w:val="0"/>
+          <w:trHeight w:val="711.5813337053571" w:hRule="atLeast"/>
           <w:tblHeader w:val="0"/>
         </w:trPr>
         <w:tc>
@@ -4399,6 +4401,7 @@
       <w:tr>
         <w:trPr>
           <w:cantSplit w:val="0"/>
+          <w:trHeight w:val="711.5813337053571" w:hRule="atLeast"/>
           <w:tblHeader w:val="0"/>
         </w:trPr>
         <w:tc>
@@ -4453,6 +4456,7 @@
       <w:tr>
         <w:trPr>
           <w:cantSplit w:val="0"/>
+          <w:trHeight w:val="711.5813337053571" w:hRule="atLeast"/>
           <w:tblHeader w:val="0"/>
         </w:trPr>
         <w:tc>
@@ -4507,6 +4511,7 @@
       <w:tr>
         <w:trPr>
           <w:cantSplit w:val="0"/>
+          <w:trHeight w:val="474.38755580357144" w:hRule="atLeast"/>
           <w:tblHeader w:val="0"/>
         </w:trPr>
         <w:tc>
@@ -4561,6 +4566,7 @@
       <w:tr>
         <w:trPr>
           <w:cantSplit w:val="0"/>
+          <w:trHeight w:val="948.7751116071429" w:hRule="atLeast"/>
           <w:tblHeader w:val="0"/>
         </w:trPr>
         <w:tc>
@@ -4615,6 +4621,7 @@
       <w:tr>
         <w:trPr>
           <w:cantSplit w:val="0"/>
+          <w:trHeight w:val="711.5813337053571" w:hRule="atLeast"/>
           <w:tblHeader w:val="0"/>
         </w:trPr>
         <w:tc>
@@ -4669,7 +4676,7 @@
       <w:tr>
         <w:trPr>
           <w:cantSplit w:val="0"/>
-          <w:trHeight w:val="512" w:hRule="atLeast"/>
+          <w:trHeight w:val="500.9486546210842" w:hRule="atLeast"/>
           <w:tblHeader w:val="0"/>
         </w:trPr>
         <w:tc>
@@ -4724,6 +4731,7 @@
       <w:tr>
         <w:trPr>
           <w:cantSplit w:val="0"/>
+          <w:trHeight w:val="237.19377790178572" w:hRule="atLeast"/>
           <w:tblHeader w:val="0"/>
         </w:trPr>
         <w:tc>
@@ -4939,7 +4947,7 @@
       </w:pPr>
       <w:sdt>
         <w:sdtPr>
-          <w:id w:val="-1616923943"/>
+          <w:id w:val="-203902206"/>
           <w:tag w:val="goog_rdk_0"/>
         </w:sdtPr>
         <w:sdtContent>
@@ -12942,6 +12950,7 @@
       </w:r>
     </w:p>
     <w:sectPr>
+      <w:headerReference r:id="rId15" w:type="default"/>
       <w:pgSz w:h="15840" w:w="12240" w:orient="portrait"/>
       <w:pgMar w:bottom="1440" w:top="1080" w:left="1584" w:right="1584" w:header="720" w:footer="720"/>
       <w:pgNumType w:start="1"/>
@@ -13012,8 +13021,23 @@
 
 <file path=word/commentsExtended.xml><?xml version="1.0" encoding="utf-8"?>
 <w15:commentsEx xmlns:mc="http://schemas.openxmlformats.org/markup-compatibility/2006" xmlns:o="urn:schemas-microsoft-com:office:office" xmlns:r="http://schemas.openxmlformats.org/officeDocument/2006/relationships" xmlns:m="http://schemas.openxmlformats.org/officeDocument/2006/math" xmlns:v="urn:schemas-microsoft-com:vml" xmlns:wp="http://schemas.openxmlformats.org/drawingml/2006/wordprocessingDrawing" xmlns:w10="urn:schemas-microsoft-com:office:word" xmlns:w="http://schemas.openxmlformats.org/wordprocessingml/2006/main" xmlns:wne="http://schemas.microsoft.com/office/word/2006/wordml" xmlns:sl="http://schemas.openxmlformats.org/schemaLibrary/2006/main" xmlns:a="http://schemas.openxmlformats.org/drawingml/2006/main" xmlns:pic="http://schemas.openxmlformats.org/drawingml/2006/picture" xmlns:c="http://schemas.openxmlformats.org/drawingml/2006/chart" xmlns:lc="http://schemas.openxmlformats.org/drawingml/2006/lockedCanvas" xmlns:dgm="http://schemas.openxmlformats.org/drawingml/2006/diagram" xmlns:wps="http://schemas.microsoft.com/office/word/2010/wordprocessingShape" xmlns:wpg="http://schemas.microsoft.com/office/word/2010/wordprocessingGroup" xmlns:w14="http://schemas.microsoft.com/office/word/2010/wordml" xmlns:w15="http://schemas.microsoft.com/office/word/2012/wordml" xmlns:w16="http://schemas.microsoft.com/office/word/2018/wordml" xmlns:w16cex="http://schemas.microsoft.com/office/word/2018/wordml/cex" xmlns:w16cid="http://schemas.microsoft.com/office/word/2016/wordml/cid" xmlns="http://schemas.microsoft.com/office/tasks/2019/documenttasks" xmlns:cr="http://schemas.microsoft.com/office/comments/2020/reactions">
-  <w15:commentEx w15:paraId="000001D1" w15:done="0"/>
+  <w15:commentEx w15:paraId="000001D2" w15:done="0"/>
 </w15:commentsEx>
+</file>
+
+<file path=word/header1.xml><?xml version="1.0" encoding="utf-8"?>
+<w:hdr xmlns:mc="http://schemas.openxmlformats.org/markup-compatibility/2006" xmlns:o="urn:schemas-microsoft-com:office:office" xmlns:r="http://schemas.openxmlformats.org/officeDocument/2006/relationships" xmlns:m="http://schemas.openxmlformats.org/officeDocument/2006/math" xmlns:v="urn:schemas-microsoft-com:vml" xmlns:wp="http://schemas.openxmlformats.org/drawingml/2006/wordprocessingDrawing" xmlns:w10="urn:schemas-microsoft-com:office:word" xmlns:w="http://schemas.openxmlformats.org/wordprocessingml/2006/main" xmlns:wne="http://schemas.microsoft.com/office/word/2006/wordml" xmlns:sl="http://schemas.openxmlformats.org/schemaLibrary/2006/main" xmlns:a="http://schemas.openxmlformats.org/drawingml/2006/main" xmlns:pic="http://schemas.openxmlformats.org/drawingml/2006/picture" xmlns:c="http://schemas.openxmlformats.org/drawingml/2006/chart" xmlns:lc="http://schemas.openxmlformats.org/drawingml/2006/lockedCanvas" xmlns:dgm="http://schemas.openxmlformats.org/drawingml/2006/diagram" xmlns:wps="http://schemas.microsoft.com/office/word/2010/wordprocessingShape" xmlns:wpg="http://schemas.microsoft.com/office/word/2010/wordprocessingGroup" xmlns:w14="http://schemas.microsoft.com/office/word/2010/wordml" xmlns:w15="http://schemas.microsoft.com/office/word/2012/wordml" xmlns:w16="http://schemas.microsoft.com/office/word/2018/wordml" xmlns:w16cex="http://schemas.microsoft.com/office/word/2018/wordml/cex" xmlns:w16cid="http://schemas.microsoft.com/office/word/2016/wordml/cid" xmlns="http://schemas.microsoft.com/office/tasks/2019/documenttasks" xmlns:cr="http://schemas.microsoft.com/office/comments/2020/reactions">
+  <w:p>
+    <w:pPr>
+      <w:rPr/>
+    </w:pPr>
+    <w:r>
+      <w:rPr>
+        <w:rtl w:val="0"/>
+      </w:rPr>
+    </w:r>
+  </w:p>
+</w:hdr>
 </file>
 
 <file path=word/numbering.xml><?xml version="1.0" encoding="utf-8"?>

</xml_diff>